<commit_message>
Revisione Pattern: Visitor, Documentazione
</commit_message>
<xml_diff>
--- a/designPattern/visitor/Visitor.docx
+++ b/designPattern/visitor/Visitor.docx
@@ -311,6 +311,9 @@
     </w:p>
     <w:p>
       <w:r>
+        <w:rPr>
+          <w:noProof/>
+        </w:rPr>
         <w:drawing>
           <wp:inline distT="0" distB="0" distL="0" distR="0" wp14:anchorId="513738EF" wp14:editId="001F949D">
             <wp:extent cx="6120130" cy="2631440"/>
@@ -378,19 +381,14 @@
       </w:r>
       <w:proofErr w:type="spellEnd"/>
       <w:r>
-        <w:t xml:space="preserve"> concreto che in questo caso è soltanto uno, il </w:t>
-      </w:r>
-      <w:proofErr w:type="gramStart"/>
-      <w:r>
-        <w:t>rappresentate</w:t>
-      </w:r>
-      <w:proofErr w:type="gramEnd"/>
-      <w:r>
-        <w:t xml:space="preserve"> dell’assicurazione:</w:t>
-      </w:r>
-    </w:p>
-    <w:p>
-      <w:r>
+        <w:t xml:space="preserve"> concreto che in questo caso è soltanto uno, il rappresentate dell’assicurazione:</w:t>
+      </w:r>
+    </w:p>
+    <w:p>
+      <w:r>
+        <w:rPr>
+          <w:noProof/>
+        </w:rPr>
         <w:drawing>
           <wp:inline distT="0" distB="0" distL="0" distR="0" wp14:anchorId="7D246B12" wp14:editId="6669E308">
             <wp:extent cx="6120130" cy="3242945"/>
@@ -457,6 +455,9 @@
     </w:p>
     <w:p>
       <w:r>
+        <w:rPr>
+          <w:noProof/>
+        </w:rPr>
         <w:drawing>
           <wp:inline distT="0" distB="0" distL="0" distR="0" wp14:anchorId="1EE36589" wp14:editId="18CA84A0">
             <wp:extent cx="6120130" cy="3147060"/>
@@ -507,6 +508,9 @@
     </w:p>
     <w:p>
       <w:r>
+        <w:rPr>
+          <w:noProof/>
+        </w:rPr>
         <w:drawing>
           <wp:inline distT="0" distB="0" distL="0" distR="0" wp14:anchorId="73553E22" wp14:editId="2356ED4A">
             <wp:extent cx="6120130" cy="2856865"/>
@@ -565,6 +569,9 @@
     </w:p>
     <w:p>
       <w:r>
+        <w:rPr>
+          <w:noProof/>
+        </w:rPr>
         <w:drawing>
           <wp:inline distT="0" distB="0" distL="0" distR="0" wp14:anchorId="494E850A" wp14:editId="616FACD9">
             <wp:extent cx="6120130" cy="3815080"/>
@@ -619,9 +626,9 @@
           <w:noProof/>
         </w:rPr>
         <w:drawing>
-          <wp:inline distT="0" distB="0" distL="0" distR="0" wp14:anchorId="1374E5AC" wp14:editId="6E41626F">
-            <wp:extent cx="3805638" cy="2574472"/>
-            <wp:effectExtent l="0" t="0" r="4445" b="0"/>
+          <wp:inline distT="0" distB="0" distL="0" distR="0" wp14:anchorId="1374E5AC" wp14:editId="71CA2F13">
+            <wp:extent cx="6310945" cy="4269284"/>
+            <wp:effectExtent l="0" t="0" r="0" b="0"/>
             <wp:docPr id="982399967" name="Immagine 1"/>
             <wp:cNvGraphicFramePr>
               <a:graphicFrameLocks xmlns:a="http://schemas.openxmlformats.org/drawingml/2006/main" noChangeAspect="1"/>
@@ -648,7 +655,7 @@
                   <pic:spPr>
                     <a:xfrm>
                       <a:off x="0" y="0"/>
-                      <a:ext cx="3805638" cy="2574472"/>
+                      <a:ext cx="6330435" cy="4282469"/>
                     </a:xfrm>
                     <a:prstGeom prst="rect">
                       <a:avLst/>

</xml_diff>